<commit_message>
Add Angular to Raya CV, React to MTS CV (working proficiency); Significa without CMS POC
Per Moamen's direction:
- profile.md §5: Angular and React added as "working proficiency"
  (self-assessed, no documented project) with a CV rule barring
  production/project claims
- Raya CV + cover letter: Angular as working proficiency; status -> ready
- MTS CV + cover letter: React as working proficiency; Node.js kept as an
  honest light mention; status -> ready
- Significa CV + cover letter: apply without an Umbraco POC — lead with
  the AI overlap, acknowledge CMS as ramp-up; drop the speculative
  pgvector claim; status -> ready
- pipeline.md / to-submit.md / README regenerated; interview-prep notes
  added (build throwaway Angular/React SPAs before technical rounds)

Co-Authored-By: Claude Sonnet 5 <noreply@anthropic.com>
</commit_message>
<xml_diff>
--- a/job-application/Misr Technology Services/Moamen_Basyoni_CV_Misr_Technology_Services.docx
+++ b/job-application/Misr Technology Services/Moamen_Basyoni_CV_Misr_Technology_Services.docx
@@ -58,7 +58,7 @@
         <w:pStyle w:val="FirstParagraph"/>
       </w:pPr>
       <w:r>
-        <w:t xml:space="preserve">Software developer with around three years architecting and building scalable, secure microservices, web applications, and APIs on .NET Core and ASP.NET Core Web API, following SOLID, DRY, and Clean Architecture with common design patterns (Repository, Factory, Dependency Injection, CQRS). Strong in RESTful and gRPC API design, Entity Framework Core and LINQ over SQL Server and PostgreSQL, and event-driven patterns with RabbitMQ. Applies OAuth2 / OpenID Connect / JWT authentication and secure coding. Works with JavaScript and TypeScript on the front end and delivers with Git, Docker, and CI/CD in an Agile team.</w:t>
+        <w:t xml:space="preserve">Software developer with around three years architecting and building scalable, secure microservices, web applications, and APIs on .NET Core and ASP.NET Core Web API, following SOLID, DRY, and Clean Architecture with common design patterns (Repository, Factory, Dependency Injection, CQRS). Strong in RESTful and gRPC API design, Entity Framework Core and LINQ over SQL Server and PostgreSQL, and event-driven patterns with RabbitMQ. Applies OAuth2 / OpenID Connect / JWT authentication and secure coding. Works with JavaScript and TypeScript on the front end, with working proficiency in React, and delivers with Git, Docker, and CI/CD in an Agile team.</w:t>
       </w:r>
     </w:p>
     <w:p>
@@ -400,7 +400,7 @@
         <w:t xml:space="preserve"> </w:t>
       </w:r>
       <w:r>
-        <w:t xml:space="preserve">JavaScript, TypeScript, jQuery, Ajax, HTML5, CSS3</w:t>
+        <w:t xml:space="preserve">JavaScript, TypeScript, React (working proficiency), jQuery, Ajax, HTML5, CSS3</w:t>
       </w:r>
     </w:p>
     <w:p>

</xml_diff>